<commit_message>
Pop-out check (5th design check), one-piece rule, safer bridges and nesting; fixes found by them (blaster pallet, dragon tabs, floral stems and leaves); UV-printed color mode with print files and Print and Cut targets; supply BOM, suppliers, economics, legal checklist; workshop planner app
Co-Authored-By: Claude Opus 5.5 <noreply@anthropic.com>
Claude-Session: https://claude.ai/code/session_013GpLQ7EJFvbKk1fPgQCCvo
</commit_message>
<xml_diff>
--- a/kits/blaster/booklet/blaster_instructions.docx
+++ b/kits/blaster/booklet/blaster_instructions.docx
@@ -4375,7 +4375,7 @@
               <w:rPr>
                 <w:b/>
               </w:rPr>
-              <w:t xml:space="preserve">  C30</w:t>
+              <w:t xml:space="preserve">  C31</w:t>
               <w:br/>
             </w:r>
             <w:r>
@@ -4416,7 +4416,7 @@
               <w:rPr>
                 <w:b/>
               </w:rPr>
-              <w:t xml:space="preserve">  C33</w:t>
+              <w:t xml:space="preserve">  C34</w:t>
               <w:br/>
             </w:r>
             <w:r>
@@ -4888,7 +4888,7 @@
               <w:rPr>
                 <w:b/>
               </w:rPr>
-              <w:t xml:space="preserve">  C31</w:t>
+              <w:t xml:space="preserve">  C32</w:t>
               <w:br/>
             </w:r>
             <w:r>
@@ -4929,7 +4929,7 @@
               <w:rPr>
                 <w:b/>
               </w:rPr>
-              <w:t xml:space="preserve">  C32</w:t>
+              <w:t xml:space="preserve">  C33</w:t>
               <w:br/>
             </w:r>
             <w:r>
@@ -8175,7 +8175,7 @@
               <w:rPr>
                 <w:b/>
               </w:rPr>
-              <w:t xml:space="preserve">  C34</w:t>
+              <w:t xml:space="preserve">  C30</w:t>
               <w:br/>
             </w:r>
             <w:r>

</xml_diff>

<commit_message>
Star Slinger lifts off its stand: U cradle on the front post (prongs 0.6 mm clear of the hull), grip between the boots, no tabs; new mount step test; lifted render on the kit page
All 5 design checks pass; the assembly-path check proves the ship drops in, and so lifts out, along a straight line.

Co-Authored-By: Claude Opus 5.5 <noreply@anthropic.com>
Claude-Session: https://claude.ai/code/session_013GpLQ7EJFvbKk1fPgQCCvo
</commit_message>
<xml_diff>
--- a/kits/blaster/booklet/blaster_instructions.docx
+++ b/kits/blaster/booklet/blaster_instructions.docx
@@ -3858,7 +3858,7 @@
               <w:rPr>
                 <w:b/>
               </w:rPr>
-              <w:t xml:space="preserve">  D8</w:t>
+              <w:t xml:space="preserve">  D2</w:t>
               <w:br/>
             </w:r>
             <w:r>
@@ -3899,7 +3899,7 @@
               <w:rPr>
                 <w:b/>
               </w:rPr>
-              <w:t xml:space="preserve">  D9</w:t>
+              <w:t xml:space="preserve">  D11</w:t>
               <w:br/>
             </w:r>
             <w:r>
@@ -4457,7 +4457,7 @@
               <w:rPr>
                 <w:b/>
               </w:rPr>
-              <w:t xml:space="preserve">  D4</w:t>
+              <w:t xml:space="preserve">  D6</w:t>
               <w:br/>
             </w:r>
             <w:r>
@@ -4498,7 +4498,7 @@
               <w:rPr>
                 <w:b/>
               </w:rPr>
-              <w:t xml:space="preserve">  D7</w:t>
+              <w:t xml:space="preserve">  D10</w:t>
               <w:br/>
             </w:r>
             <w:r>
@@ -4539,7 +4539,7 @@
               <w:rPr>
                 <w:b/>
               </w:rPr>
-              <w:t xml:space="preserve">  D11</w:t>
+              <w:t xml:space="preserve">  D12</w:t>
               <w:br/>
             </w:r>
             <w:r>
@@ -4580,7 +4580,7 @@
               <w:rPr>
                 <w:b/>
               </w:rPr>
-              <w:t xml:space="preserve">  D12</w:t>
+              <w:t xml:space="preserve">  D13</w:t>
               <w:br/>
             </w:r>
           </w:p>
@@ -5282,7 +5282,7 @@
               <w:rPr>
                 <w:b/>
               </w:rPr>
-              <w:t xml:space="preserve">  D3 x2</w:t>
+              <w:t xml:space="preserve">  D9 x2</w:t>
               <w:br/>
             </w:r>
             <w:r>
@@ -6911,7 +6911,7 @@
               <w:rPr>
                 <w:b/>
               </w:rPr>
-              <w:t xml:space="preserve">  D1</w:t>
+              <w:t xml:space="preserve">  D3</w:t>
               <w:br/>
             </w:r>
             <w:r>
@@ -6952,7 +6952,7 @@
               <w:rPr>
                 <w:b/>
               </w:rPr>
-              <w:t xml:space="preserve">  D5</w:t>
+              <w:t xml:space="preserve">  D4</w:t>
               <w:br/>
             </w:r>
             <w:r>
@@ -6993,7 +6993,7 @@
               <w:rPr>
                 <w:b/>
               </w:rPr>
-              <w:t xml:space="preserve">  D10</w:t>
+              <w:t xml:space="preserve">  D8</w:t>
               <w:br/>
             </w:r>
           </w:p>
@@ -7658,7 +7658,7 @@
               <w:rPr>
                 <w:b/>
               </w:rPr>
-              <w:t xml:space="preserve">  D13</w:t>
+              <w:t xml:space="preserve">  D14</w:t>
               <w:br/>
             </w:r>
           </w:p>
@@ -8257,7 +8257,7 @@
               <w:rPr>
                 <w:b/>
               </w:rPr>
-              <w:t xml:space="preserve">  D2</w:t>
+              <w:t xml:space="preserve">  D1</w:t>
               <w:br/>
             </w:r>
             <w:r>
@@ -8298,7 +8298,7 @@
               <w:rPr>
                 <w:b/>
               </w:rPr>
-              <w:t xml:space="preserve">  D6 x2</w:t>
+              <w:t xml:space="preserve">  D5 x2</w:t>
               <w:br/>
             </w:r>
             <w:r>
@@ -8339,7 +8339,7 @@
               <w:rPr>
                 <w:b/>
               </w:rPr>
-              <w:t xml:space="preserve">  D14</w:t>
+              <w:t xml:space="preserve">  D7</w:t>
               <w:br/>
             </w:r>
             <w:r>
@@ -8604,7 +8604,7 @@
                 <w:color w:val="3A2A1F"/>
                 <w:sz w:val="40"/>
               </w:rPr>
-              <w:t>Put the ship on its launch stand</w:t>
+              <w:t>Drop the ship onto its launch stand</w:t>
             </w:r>
           </w:p>
         </w:tc>
@@ -8752,10 +8752,62 @@
         <w:t xml:space="preserve"> </w:t>
       </w:r>
       <w:r>
+        <w:drawing>
+          <wp:inline xmlns:a="http://schemas.openxmlformats.org/drawingml/2006/main" xmlns:pic="http://schemas.openxmlformats.org/drawingml/2006/picture">
+            <wp:extent cx="384048" cy="384048"/>
+            <wp:docPr id="180" name="Picture 180"/>
+            <wp:cNvGraphicFramePr>
+              <a:graphicFrameLocks noChangeAspect="1"/>
+            </wp:cNvGraphicFramePr>
+            <a:graphic>
+              <a:graphicData uri="http://schemas.openxmlformats.org/drawingml/2006/picture">
+                <pic:pic>
+                  <pic:nvPicPr>
+                    <pic:cNvPr id="0" name="test.png"/>
+                    <pic:cNvPicPr/>
+                  </pic:nvPicPr>
+                  <pic:blipFill>
+                    <a:blip r:embed="rId16"/>
+                    <a:stretch>
+                      <a:fillRect/>
+                    </a:stretch>
+                  </pic:blipFill>
+                  <pic:spPr>
+                    <a:xfrm>
+                      <a:off x="0" y="0"/>
+                      <a:ext cx="384048" cy="384048"/>
+                    </a:xfrm>
+                    <a:prstGeom prst="rect"/>
+                  </pic:spPr>
+                </pic:pic>
+              </a:graphicData>
+            </a:graphic>
+          </wp:inline>
+        </w:drawing>
+      </w:r>
+      <w:r>
+        <w:t xml:space="preserve"> </w:t>
+      </w:r>
+      <w:r>
         <w:rPr>
           <w:sz w:val="26"/>
         </w:rPr>
-        <w:t xml:space="preserve">  Grip between the two boots, barrel on the upright.</w:t>
+        <w:t xml:space="preserve">  Grip between the two boots, barrel in the cradle. No tabs: it lifts straight off.</w:t>
+      </w:r>
+    </w:p>
+    <w:p>
+      <w:r>
+        <w:rPr>
+          <w:b/>
+          <w:color w:val="0B6158"/>
+        </w:rPr>
+        <w:t xml:space="preserve">TEST IT NOW: </w:t>
+      </w:r>
+      <w:r>
+        <w:rPr>
+          <w:color w:val="0B6158"/>
+        </w:rPr>
+        <w:t>Lift the ship straight up, then set it back. It should drop in by itself and not wobble.</w:t>
       </w:r>
     </w:p>
     <w:p>
@@ -8779,7 +8831,7 @@
         <w:drawing>
           <wp:inline xmlns:a="http://schemas.openxmlformats.org/drawingml/2006/main" xmlns:pic="http://schemas.openxmlformats.org/drawingml/2006/picture">
             <wp:extent cx="5943600" cy="4457700"/>
-            <wp:docPr id="180" name="Picture 180"/>
+            <wp:docPr id="181" name="Picture 181"/>
             <wp:cNvGraphicFramePr>
               <a:graphicFrameLocks noChangeAspect="1"/>
             </wp:cNvGraphicFramePr>

</xml_diff>